<commit_message>
Add AM-FNO and KNO model difference analysis
</commit_message>
<xml_diff>
--- a/reports/final_kno_amfno_report.docx
+++ b/reports/final_kno_amfno_report.docx
@@ -7328,6 +7328,2067 @@
     </w:p>
     <w:p>
       <w:pPr>
+        <w:pStyle w:val="Heading2"/>
+      </w:pPr>
+      <w:r>
+        <w:t>5.4 AM-FNO 与 KNO 的关键差异及误差来源</w:t>
+      </w:r>
+    </w:p>
+    <w:p>
+      <w:pPr>
+        <w:spacing w:before="0" w:after="120" w:line="264" w:lineRule="auto"/>
+      </w:pPr>
+      <w:r>
+        <w:rPr>
+          <w:rFonts w:ascii="Calibri" w:hAnsi="Calibri" w:eastAsia="Microsoft YaHei"/>
+          <w:b w:val="0"/>
+          <w:i w:val="0"/>
+          <w:color w:val="1F1F1F"/>
+          <w:sz w:val="22"/>
+        </w:rPr>
+        <w:t>AM-FNO 和 KNO 都在 Fourier 空间中学习算子，但二者的建模目标和参数使用方式不同。这也是本次实验中 NS-2D 可比较、CFD 尤其是 CFD-2D 差距明显的主要模型层面原因。</w:t>
+      </w:r>
+    </w:p>
+    <w:tbl>
+      <w:tblPr>
+        <w:tblStyle w:val="TableGrid"/>
+        <w:tblW w:type="dxa" w:w="9360"/>
+        <w:tblLayout w:type="fixed"/>
+        <w:tblLook w:firstColumn="1" w:firstRow="1" w:lastColumn="0" w:lastRow="0" w:noHBand="0" w:noVBand="1" w:val="04A0"/>
+        <w:tblInd w:w="120" w:type="dxa"/>
+        <w:tblBorders>
+          <w:top w:val="single" w:sz="4" w:space="0" w:color="D9E2EC"/>
+          <w:left w:val="single" w:sz="4" w:space="0" w:color="D9E2EC"/>
+          <w:bottom w:val="single" w:sz="4" w:space="0" w:color="D9E2EC"/>
+          <w:right w:val="single" w:sz="4" w:space="0" w:color="D9E2EC"/>
+          <w:insideH w:val="single" w:sz="4" w:space="0" w:color="D9E2EC"/>
+          <w:insideV w:val="single" w:sz="4" w:space="0" w:color="D9E2EC"/>
+        </w:tblBorders>
+      </w:tblPr>
+      <w:tblGrid>
+        <w:gridCol w:w="1700"/>
+        <w:gridCol w:w="2350"/>
+        <w:gridCol w:w="2350"/>
+        <w:gridCol w:w="2960"/>
+      </w:tblGrid>
+      <w:tr>
+        <w:trPr>
+          <w:tblHeader w:val="true"/>
+        </w:trPr>
+        <w:tc>
+          <w:tcPr>
+            <w:tcW w:type="dxa" w:w="1700"/>
+            <w:tcMar>
+              <w:top w:w="80" w:type="dxa"/>
+              <w:start w:w="120" w:type="dxa"/>
+              <w:bottom w:w="80" w:type="dxa"/>
+              <w:end w:w="120" w:type="dxa"/>
+            </w:tcMar>
+            <w:vAlign w:val="center"/>
+            <w:shd w:fill="F2F4F7"/>
+          </w:tcPr>
+          <w:p>
+            <w:pPr>
+              <w:spacing w:before="0" w:after="40" w:line="252" w:lineRule="auto"/>
+              <w:jc w:val="center"/>
+            </w:pPr>
+            <w:r>
+              <w:rPr>
+                <w:rFonts w:ascii="Calibri" w:hAnsi="Calibri" w:eastAsia="Microsoft YaHei"/>
+                <w:b/>
+                <w:i w:val="0"/>
+                <w:color w:val="202A35"/>
+                <w:sz w:val="18"/>
+              </w:rPr>
+              <w:t>Aspect</w:t>
+            </w:r>
+          </w:p>
+        </w:tc>
+        <w:tc>
+          <w:tcPr>
+            <w:tcW w:type="dxa" w:w="2350"/>
+            <w:tcMar>
+              <w:top w:w="80" w:type="dxa"/>
+              <w:start w:w="120" w:type="dxa"/>
+              <w:bottom w:w="80" w:type="dxa"/>
+              <w:end w:w="120" w:type="dxa"/>
+            </w:tcMar>
+            <w:vAlign w:val="center"/>
+            <w:shd w:fill="F2F4F7"/>
+          </w:tcPr>
+          <w:p>
+            <w:pPr>
+              <w:spacing w:before="0" w:after="40" w:line="252" w:lineRule="auto"/>
+              <w:jc w:val="center"/>
+            </w:pPr>
+            <w:r>
+              <w:rPr>
+                <w:rFonts w:ascii="Calibri" w:hAnsi="Calibri" w:eastAsia="Microsoft YaHei"/>
+                <w:b/>
+                <w:i w:val="0"/>
+                <w:color w:val="202A35"/>
+                <w:sz w:val="18"/>
+              </w:rPr>
+              <w:t>AM-FNO local reproduction</w:t>
+            </w:r>
+          </w:p>
+        </w:tc>
+        <w:tc>
+          <w:tcPr>
+            <w:tcW w:type="dxa" w:w="2350"/>
+            <w:tcMar>
+              <w:top w:w="80" w:type="dxa"/>
+              <w:start w:w="120" w:type="dxa"/>
+              <w:bottom w:w="80" w:type="dxa"/>
+              <w:end w:w="120" w:type="dxa"/>
+            </w:tcMar>
+            <w:vAlign w:val="center"/>
+            <w:shd w:fill="F2F4F7"/>
+          </w:tcPr>
+          <w:p>
+            <w:pPr>
+              <w:spacing w:before="0" w:after="40" w:line="252" w:lineRule="auto"/>
+              <w:jc w:val="center"/>
+            </w:pPr>
+            <w:r>
+              <w:rPr>
+                <w:rFonts w:ascii="Calibri" w:hAnsi="Calibri" w:eastAsia="Microsoft YaHei"/>
+                <w:b/>
+                <w:i w:val="0"/>
+                <w:color w:val="202A35"/>
+                <w:sz w:val="18"/>
+              </w:rPr>
+              <w:t>KNO implementation in this project</w:t>
+            </w:r>
+          </w:p>
+        </w:tc>
+        <w:tc>
+          <w:tcPr>
+            <w:tcW w:type="dxa" w:w="2960"/>
+            <w:tcMar>
+              <w:top w:w="80" w:type="dxa"/>
+              <w:start w:w="120" w:type="dxa"/>
+              <w:bottom w:w="80" w:type="dxa"/>
+              <w:end w:w="120" w:type="dxa"/>
+            </w:tcMar>
+            <w:vAlign w:val="center"/>
+            <w:shd w:fill="F2F4F7"/>
+          </w:tcPr>
+          <w:p>
+            <w:pPr>
+              <w:spacing w:before="0" w:after="40" w:line="252" w:lineRule="auto"/>
+              <w:jc w:val="center"/>
+            </w:pPr>
+            <w:r>
+              <w:rPr>
+                <w:rFonts w:ascii="Calibri" w:hAnsi="Calibri" w:eastAsia="Microsoft YaHei"/>
+                <w:b/>
+                <w:i w:val="0"/>
+                <w:color w:val="202A35"/>
+                <w:sz w:val="18"/>
+              </w:rPr>
+              <w:t>Effect in this experiment</w:t>
+            </w:r>
+          </w:p>
+        </w:tc>
+      </w:tr>
+      <w:tr>
+        <w:tc>
+          <w:tcPr>
+            <w:tcW w:type="dxa" w:w="1700"/>
+            <w:tcMar>
+              <w:top w:w="80" w:type="dxa"/>
+              <w:start w:w="120" w:type="dxa"/>
+              <w:bottom w:w="80" w:type="dxa"/>
+              <w:end w:w="120" w:type="dxa"/>
+            </w:tcMar>
+            <w:vAlign w:val="center"/>
+          </w:tcPr>
+          <w:p>
+            <w:pPr>
+              <w:spacing w:before="0" w:after="40" w:line="252" w:lineRule="auto"/>
+              <w:jc w:val="center"/>
+            </w:pPr>
+            <w:r>
+              <w:rPr>
+                <w:rFonts w:ascii="Calibri" w:hAnsi="Calibri" w:eastAsia="Microsoft YaHei"/>
+                <w:b w:val="0"/>
+                <w:i w:val="0"/>
+                <w:color w:val="1F1F1F"/>
+                <w:sz w:val="18"/>
+              </w:rPr>
+              <w:t>Fourier kernel</w:t>
+            </w:r>
+          </w:p>
+        </w:tc>
+        <w:tc>
+          <w:tcPr>
+            <w:tcW w:type="dxa" w:w="2350"/>
+            <w:tcMar>
+              <w:top w:w="80" w:type="dxa"/>
+              <w:start w:w="120" w:type="dxa"/>
+              <w:bottom w:w="80" w:type="dxa"/>
+              <w:end w:w="120" w:type="dxa"/>
+            </w:tcMar>
+            <w:vAlign w:val="center"/>
+          </w:tcPr>
+          <w:p>
+            <w:pPr>
+              <w:spacing w:before="0" w:after="40" w:line="252" w:lineRule="auto"/>
+              <w:jc w:val="left"/>
+            </w:pPr>
+            <w:r>
+              <w:rPr>
+                <w:rFonts w:ascii="Calibri" w:hAnsi="Calibri" w:eastAsia="Microsoft YaHei"/>
+                <w:b w:val="0"/>
+                <w:i w:val="0"/>
+                <w:color w:val="1F1F1F"/>
+                <w:sz w:val="18"/>
+              </w:rPr>
+              <w:t>使用 FNO 主干，4 个 spectral block；MLP/KAN 根据频率坐标生成复数 Fourier kernel。</w:t>
+            </w:r>
+          </w:p>
+        </w:tc>
+        <w:tc>
+          <w:tcPr>
+            <w:tcW w:type="dxa" w:w="2350"/>
+            <w:tcMar>
+              <w:top w:w="80" w:type="dxa"/>
+              <w:start w:w="120" w:type="dxa"/>
+              <w:bottom w:w="80" w:type="dxa"/>
+              <w:end w:w="120" w:type="dxa"/>
+            </w:tcMar>
+            <w:vAlign w:val="center"/>
+          </w:tcPr>
+          <w:p>
+            <w:pPr>
+              <w:spacing w:before="0" w:after="40" w:line="252" w:lineRule="auto"/>
+              <w:jc w:val="left"/>
+            </w:pPr>
+            <w:r>
+              <w:rPr>
+                <w:rFonts w:ascii="Calibri" w:hAnsi="Calibri" w:eastAsia="Microsoft YaHei"/>
+                <w:b w:val="0"/>
+                <w:i w:val="0"/>
+                <w:color w:val="1F1F1F"/>
+                <w:sz w:val="18"/>
+              </w:rPr>
+              <w:t>encoder 将输入映射到观测空间；低频 Fourier modes 上使用可学习 Koopman matrix。</w:t>
+            </w:r>
+          </w:p>
+        </w:tc>
+        <w:tc>
+          <w:tcPr>
+            <w:tcW w:type="dxa" w:w="2960"/>
+            <w:tcMar>
+              <w:top w:w="80" w:type="dxa"/>
+              <w:start w:w="120" w:type="dxa"/>
+              <w:bottom w:w="80" w:type="dxa"/>
+              <w:end w:w="120" w:type="dxa"/>
+            </w:tcMar>
+            <w:vAlign w:val="center"/>
+          </w:tcPr>
+          <w:p>
+            <w:pPr>
+              <w:spacing w:before="0" w:after="40" w:line="252" w:lineRule="auto"/>
+              <w:jc w:val="left"/>
+            </w:pPr>
+            <w:r>
+              <w:rPr>
+                <w:rFonts w:ascii="Calibri" w:hAnsi="Calibri" w:eastAsia="Microsoft YaHei"/>
+                <w:b w:val="0"/>
+                <w:i w:val="0"/>
+                <w:color w:val="1F1F1F"/>
+                <w:sz w:val="18"/>
+              </w:rPr>
+              <w:t>AM-FNO 的 kernel 更直接面向空间频率响应；KNO 的 kernel 更强调观测空间时间推进。</w:t>
+            </w:r>
+          </w:p>
+        </w:tc>
+      </w:tr>
+      <w:tr>
+        <w:tc>
+          <w:tcPr>
+            <w:tcW w:type="dxa" w:w="1700"/>
+            <w:tcMar>
+              <w:top w:w="80" w:type="dxa"/>
+              <w:start w:w="120" w:type="dxa"/>
+              <w:bottom w:w="80" w:type="dxa"/>
+              <w:end w:w="120" w:type="dxa"/>
+            </w:tcMar>
+            <w:vAlign w:val="center"/>
+          </w:tcPr>
+          <w:p>
+            <w:pPr>
+              <w:spacing w:before="0" w:after="40" w:line="252" w:lineRule="auto"/>
+              <w:jc w:val="center"/>
+            </w:pPr>
+            <w:r>
+              <w:rPr>
+                <w:rFonts w:ascii="Calibri" w:hAnsi="Calibri" w:eastAsia="Microsoft YaHei"/>
+                <w:b w:val="0"/>
+                <w:i w:val="0"/>
+                <w:color w:val="1F1F1F"/>
+                <w:sz w:val="18"/>
+              </w:rPr>
+              <w:t>Time modeling</w:t>
+            </w:r>
+          </w:p>
+        </w:tc>
+        <w:tc>
+          <w:tcPr>
+            <w:tcW w:type="dxa" w:w="2350"/>
+            <w:tcMar>
+              <w:top w:w="80" w:type="dxa"/>
+              <w:start w:w="120" w:type="dxa"/>
+              <w:bottom w:w="80" w:type="dxa"/>
+              <w:end w:w="120" w:type="dxa"/>
+            </w:tcMar>
+            <w:vAlign w:val="center"/>
+          </w:tcPr>
+          <w:p>
+            <w:pPr>
+              <w:spacing w:before="0" w:after="40" w:line="252" w:lineRule="auto"/>
+              <w:jc w:val="left"/>
+            </w:pPr>
+            <w:r>
+              <w:rPr>
+                <w:rFonts w:ascii="Calibri" w:hAnsi="Calibri" w:eastAsia="Microsoft YaHei"/>
+                <w:b w:val="0"/>
+                <w:i w:val="0"/>
+                <w:color w:val="1F1F1F"/>
+                <w:sz w:val="18"/>
+              </w:rPr>
+              <w:t>对输入窗口到下一帧/输出变量做 supervised mapping，再 rollout。</w:t>
+            </w:r>
+          </w:p>
+        </w:tc>
+        <w:tc>
+          <w:tcPr>
+            <w:tcW w:type="dxa" w:w="2350"/>
+            <w:tcMar>
+              <w:top w:w="80" w:type="dxa"/>
+              <w:start w:w="120" w:type="dxa"/>
+              <w:bottom w:w="80" w:type="dxa"/>
+              <w:end w:w="120" w:type="dxa"/>
+            </w:tcMar>
+            <w:vAlign w:val="center"/>
+          </w:tcPr>
+          <w:p>
+            <w:pPr>
+              <w:spacing w:before="0" w:after="40" w:line="252" w:lineRule="auto"/>
+              <w:jc w:val="left"/>
+            </w:pPr>
+            <w:r>
+              <w:rPr>
+                <w:rFonts w:ascii="Calibri" w:hAnsi="Calibri" w:eastAsia="Microsoft YaHei"/>
+                <w:b w:val="0"/>
+                <w:i w:val="0"/>
+                <w:color w:val="1F1F1F"/>
+                <w:sz w:val="18"/>
+              </w:rPr>
+              <w:t xml:space="preserve">在观测空间中重复 </w:t>
+            </w:r>
+            <w:r>
+              <w:rPr>
+                <w:rFonts w:ascii="Consolas" w:hAnsi="Consolas" w:eastAsia="Microsoft YaHei"/>
+                <w:b w:val="0"/>
+                <w:i w:val="0"/>
+                <w:color w:val="333333"/>
+                <w:sz w:val="18"/>
+              </w:rPr>
+              <w:t>decompose=8</w:t>
+            </w:r>
+            <w:r>
+              <w:rPr>
+                <w:rFonts w:ascii="Calibri" w:hAnsi="Calibri" w:eastAsia="Microsoft YaHei"/>
+                <w:b w:val="0"/>
+                <w:i w:val="0"/>
+                <w:color w:val="1F1F1F"/>
+                <w:sz w:val="18"/>
+              </w:rPr>
+              <w:t xml:space="preserve"> 次 Koopman update，强调同一线性推进算子的时间复合。</w:t>
+            </w:r>
+          </w:p>
+        </w:tc>
+        <w:tc>
+          <w:tcPr>
+            <w:tcW w:type="dxa" w:w="2960"/>
+            <w:tcMar>
+              <w:top w:w="80" w:type="dxa"/>
+              <w:start w:w="120" w:type="dxa"/>
+              <w:bottom w:w="80" w:type="dxa"/>
+              <w:end w:w="120" w:type="dxa"/>
+            </w:tcMar>
+            <w:vAlign w:val="center"/>
+          </w:tcPr>
+          <w:p>
+            <w:pPr>
+              <w:spacing w:before="0" w:after="40" w:line="252" w:lineRule="auto"/>
+              <w:jc w:val="left"/>
+            </w:pPr>
+            <w:r>
+              <w:rPr>
+                <w:rFonts w:ascii="Calibri" w:hAnsi="Calibri" w:eastAsia="Microsoft YaHei"/>
+                <w:b w:val="0"/>
+                <w:i w:val="0"/>
+                <w:color w:val="1F1F1F"/>
+                <w:sz w:val="18"/>
+              </w:rPr>
+              <w:t>KNO 对 NS-2D 这类单变量演化较自然；CFD 多变量耦合需要额外适配。</w:t>
+            </w:r>
+          </w:p>
+        </w:tc>
+      </w:tr>
+      <w:tr>
+        <w:tc>
+          <w:tcPr>
+            <w:tcW w:type="dxa" w:w="1700"/>
+            <w:tcMar>
+              <w:top w:w="80" w:type="dxa"/>
+              <w:start w:w="120" w:type="dxa"/>
+              <w:bottom w:w="80" w:type="dxa"/>
+              <w:end w:w="120" w:type="dxa"/>
+            </w:tcMar>
+            <w:vAlign w:val="center"/>
+          </w:tcPr>
+          <w:p>
+            <w:pPr>
+              <w:spacing w:before="0" w:after="40" w:line="252" w:lineRule="auto"/>
+              <w:jc w:val="left"/>
+            </w:pPr>
+            <w:r>
+              <w:rPr>
+                <w:rFonts w:ascii="Calibri" w:hAnsi="Calibri" w:eastAsia="Microsoft YaHei"/>
+                <w:b w:val="0"/>
+                <w:i w:val="0"/>
+                <w:color w:val="1F1F1F"/>
+                <w:sz w:val="18"/>
+              </w:rPr>
+              <w:t>Spatial coordinates</w:t>
+            </w:r>
+          </w:p>
+        </w:tc>
+        <w:tc>
+          <w:tcPr>
+            <w:tcW w:type="dxa" w:w="2350"/>
+            <w:tcMar>
+              <w:top w:w="80" w:type="dxa"/>
+              <w:start w:w="120" w:type="dxa"/>
+              <w:bottom w:w="80" w:type="dxa"/>
+              <w:end w:w="120" w:type="dxa"/>
+            </w:tcMar>
+            <w:vAlign w:val="center"/>
+          </w:tcPr>
+          <w:p>
+            <w:pPr>
+              <w:spacing w:before="0" w:after="40" w:line="252" w:lineRule="auto"/>
+              <w:jc w:val="left"/>
+            </w:pPr>
+            <w:r>
+              <w:rPr>
+                <w:rFonts w:ascii="Calibri" w:hAnsi="Calibri" w:eastAsia="Microsoft YaHei"/>
+                <w:b w:val="0"/>
+                <w:i w:val="0"/>
+                <w:color w:val="1F1F1F"/>
+                <w:sz w:val="18"/>
+              </w:rPr>
+              <w:t xml:space="preserve">AM-FNO 将 grid 坐标拼到输入通道，1D 加 </w:t>
+            </w:r>
+            <w:r>
+              <w:rPr>
+                <w:rFonts w:ascii="Consolas" w:hAnsi="Consolas" w:eastAsia="Microsoft YaHei"/>
+                <w:b w:val="0"/>
+                <w:i w:val="0"/>
+                <w:color w:val="333333"/>
+                <w:sz w:val="18"/>
+              </w:rPr>
+              <w:t>x</w:t>
+            </w:r>
+            <w:r>
+              <w:rPr>
+                <w:rFonts w:ascii="Calibri" w:hAnsi="Calibri" w:eastAsia="Microsoft YaHei"/>
+                <w:b w:val="0"/>
+                <w:i w:val="0"/>
+                <w:color w:val="1F1F1F"/>
+                <w:sz w:val="18"/>
+              </w:rPr>
+              <w:t xml:space="preserve">，2D 加 </w:t>
+            </w:r>
+            <w:r>
+              <w:rPr>
+                <w:rFonts w:ascii="Consolas" w:hAnsi="Consolas" w:eastAsia="Microsoft YaHei"/>
+                <w:b w:val="0"/>
+                <w:i w:val="0"/>
+                <w:color w:val="333333"/>
+                <w:sz w:val="18"/>
+              </w:rPr>
+              <w:t>(x,y)</w:t>
+            </w:r>
+            <w:r>
+              <w:rPr>
+                <w:rFonts w:ascii="Calibri" w:hAnsi="Calibri" w:eastAsia="Microsoft YaHei"/>
+                <w:b w:val="0"/>
+                <w:i w:val="0"/>
+                <w:color w:val="1F1F1F"/>
+                <w:sz w:val="18"/>
+              </w:rPr>
+              <w:t>。</w:t>
+            </w:r>
+          </w:p>
+        </w:tc>
+        <w:tc>
+          <w:tcPr>
+            <w:tcW w:type="dxa" w:w="2350"/>
+            <w:tcMar>
+              <w:top w:w="80" w:type="dxa"/>
+              <w:start w:w="120" w:type="dxa"/>
+              <w:bottom w:w="80" w:type="dxa"/>
+              <w:end w:w="120" w:type="dxa"/>
+            </w:tcMar>
+            <w:vAlign w:val="center"/>
+          </w:tcPr>
+          <w:p>
+            <w:pPr>
+              <w:spacing w:before="0" w:after="40" w:line="252" w:lineRule="auto"/>
+              <w:jc w:val="left"/>
+            </w:pPr>
+            <w:r>
+              <w:rPr>
+                <w:rFonts w:ascii="Calibri" w:hAnsi="Calibri" w:eastAsia="Microsoft YaHei"/>
+                <w:b w:val="0"/>
+                <w:i w:val="0"/>
+                <w:color w:val="1F1F1F"/>
+                <w:sz w:val="18"/>
+              </w:rPr>
+              <w:t>当前 KNO 训练脚本读取 grid，但模型 forward 未显式使用 grid。</w:t>
+            </w:r>
+          </w:p>
+        </w:tc>
+        <w:tc>
+          <w:tcPr>
+            <w:tcW w:type="dxa" w:w="2960"/>
+            <w:tcMar>
+              <w:top w:w="80" w:type="dxa"/>
+              <w:start w:w="120" w:type="dxa"/>
+              <w:bottom w:w="80" w:type="dxa"/>
+              <w:end w:w="120" w:type="dxa"/>
+            </w:tcMar>
+            <w:vAlign w:val="center"/>
+          </w:tcPr>
+          <w:p>
+            <w:pPr>
+              <w:spacing w:before="0" w:after="40" w:line="252" w:lineRule="auto"/>
+              <w:jc w:val="left"/>
+            </w:pPr>
+            <w:r>
+              <w:rPr>
+                <w:rFonts w:ascii="Calibri" w:hAnsi="Calibri" w:eastAsia="Microsoft YaHei"/>
+                <w:b w:val="0"/>
+                <w:i w:val="0"/>
+                <w:color w:val="1F1F1F"/>
+                <w:sz w:val="18"/>
+              </w:rPr>
+              <w:t>CFD-2D 中空间位置和边界/周期结构信息对局部模式有帮助，KNO 少了这一显式条件。</w:t>
+            </w:r>
+          </w:p>
+        </w:tc>
+      </w:tr>
+      <w:tr>
+        <w:tc>
+          <w:tcPr>
+            <w:tcW w:type="dxa" w:w="1700"/>
+            <w:tcMar>
+              <w:top w:w="80" w:type="dxa"/>
+              <w:start w:w="120" w:type="dxa"/>
+              <w:bottom w:w="80" w:type="dxa"/>
+              <w:end w:w="120" w:type="dxa"/>
+            </w:tcMar>
+            <w:vAlign w:val="center"/>
+          </w:tcPr>
+          <w:p>
+            <w:pPr>
+              <w:spacing w:before="0" w:after="40" w:line="252" w:lineRule="auto"/>
+              <w:jc w:val="left"/>
+            </w:pPr>
+            <w:r>
+              <w:rPr>
+                <w:rFonts w:ascii="Calibri" w:hAnsi="Calibri" w:eastAsia="Microsoft YaHei"/>
+                <w:b w:val="0"/>
+                <w:i w:val="0"/>
+                <w:color w:val="1F1F1F"/>
+                <w:sz w:val="18"/>
+              </w:rPr>
+              <w:t>Multi-variable handling</w:t>
+            </w:r>
+          </w:p>
+        </w:tc>
+        <w:tc>
+          <w:tcPr>
+            <w:tcW w:type="dxa" w:w="2350"/>
+            <w:tcMar>
+              <w:top w:w="80" w:type="dxa"/>
+              <w:start w:w="120" w:type="dxa"/>
+              <w:bottom w:w="80" w:type="dxa"/>
+              <w:end w:w="120" w:type="dxa"/>
+            </w:tcMar>
+            <w:vAlign w:val="center"/>
+          </w:tcPr>
+          <w:p>
+            <w:pPr>
+              <w:spacing w:before="0" w:after="40" w:line="252" w:lineRule="auto"/>
+              <w:jc w:val="left"/>
+            </w:pPr>
+            <w:r>
+              <w:rPr>
+                <w:rFonts w:ascii="Calibri" w:hAnsi="Calibri" w:eastAsia="Microsoft YaHei"/>
+                <w:b w:val="0"/>
+                <w:i w:val="0"/>
+                <w:color w:val="1F1F1F"/>
+                <w:sz w:val="18"/>
+              </w:rPr>
+              <w:t>输入维度直接包含历史窗口、变量和坐标，并通过 FNO block 混合。</w:t>
+            </w:r>
+          </w:p>
+        </w:tc>
+        <w:tc>
+          <w:tcPr>
+            <w:tcW w:type="dxa" w:w="2350"/>
+            <w:tcMar>
+              <w:top w:w="80" w:type="dxa"/>
+              <w:start w:w="120" w:type="dxa"/>
+              <w:bottom w:w="80" w:type="dxa"/>
+              <w:end w:w="120" w:type="dxa"/>
+            </w:tcMar>
+            <w:vAlign w:val="center"/>
+          </w:tcPr>
+          <w:p>
+            <w:pPr>
+              <w:spacing w:before="0" w:after="40" w:line="252" w:lineRule="auto"/>
+              <w:jc w:val="left"/>
+            </w:pPr>
+            <w:r>
+              <w:rPr>
+                <w:rFonts w:ascii="Calibri" w:hAnsi="Calibri" w:eastAsia="Microsoft YaHei"/>
+                <w:b w:val="0"/>
+                <w:i w:val="0"/>
+                <w:color w:val="1F1F1F"/>
+                <w:sz w:val="18"/>
+              </w:rPr>
+              <w:t xml:space="preserve">CFD 中将 </w:t>
+            </w:r>
+            <w:r>
+              <w:rPr>
+                <w:rFonts w:ascii="Consolas" w:hAnsi="Consolas" w:eastAsia="Microsoft YaHei"/>
+                <w:b w:val="0"/>
+                <w:i w:val="0"/>
+                <w:color w:val="333333"/>
+                <w:sz w:val="18"/>
+              </w:rPr>
+              <w:t>initial_step * variables</w:t>
+            </w:r>
+            <w:r>
+              <w:rPr>
+                <w:rFonts w:ascii="Calibri" w:hAnsi="Calibri" w:eastAsia="Microsoft YaHei"/>
+                <w:b w:val="0"/>
+                <w:i w:val="0"/>
+                <w:color w:val="1F1F1F"/>
+                <w:sz w:val="18"/>
+              </w:rPr>
+              <w:t xml:space="preserve"> 压平为通道，再用线性 encoder 映射到 </w:t>
+            </w:r>
+            <w:r>
+              <w:rPr>
+                <w:rFonts w:ascii="Consolas" w:hAnsi="Consolas" w:eastAsia="Microsoft YaHei"/>
+                <w:b w:val="0"/>
+                <w:i w:val="0"/>
+                <w:color w:val="333333"/>
+                <w:sz w:val="18"/>
+              </w:rPr>
+              <w:t>o</w:t>
+            </w:r>
+            <w:r>
+              <w:rPr>
+                <w:rFonts w:ascii="Calibri" w:hAnsi="Calibri" w:eastAsia="Microsoft YaHei"/>
+                <w:b w:val="0"/>
+                <w:i w:val="0"/>
+                <w:color w:val="1F1F1F"/>
+                <w:sz w:val="18"/>
+              </w:rPr>
+              <w:t xml:space="preserve"> 维。</w:t>
+            </w:r>
+          </w:p>
+        </w:tc>
+        <w:tc>
+          <w:tcPr>
+            <w:tcW w:type="dxa" w:w="2960"/>
+            <w:tcMar>
+              <w:top w:w="80" w:type="dxa"/>
+              <w:start w:w="120" w:type="dxa"/>
+              <w:bottom w:w="80" w:type="dxa"/>
+              <w:end w:w="120" w:type="dxa"/>
+            </w:tcMar>
+            <w:vAlign w:val="center"/>
+          </w:tcPr>
+          <w:p>
+            <w:pPr>
+              <w:spacing w:before="0" w:after="40" w:line="252" w:lineRule="auto"/>
+              <w:jc w:val="left"/>
+            </w:pPr>
+            <w:r>
+              <w:rPr>
+                <w:rFonts w:ascii="Calibri" w:hAnsi="Calibri" w:eastAsia="Microsoft YaHei"/>
+                <w:b w:val="0"/>
+                <w:i w:val="0"/>
+                <w:color w:val="1F1F1F"/>
+                <w:sz w:val="18"/>
+              </w:rPr>
+              <w:t>KNO 的变量耦合主要依赖单个线性 encoder，缺少变量专用 encoder 或 cross-variable block。</w:t>
+            </w:r>
+          </w:p>
+        </w:tc>
+      </w:tr>
+      <w:tr>
+        <w:tc>
+          <w:tcPr>
+            <w:tcW w:type="dxa" w:w="1700"/>
+            <w:tcMar>
+              <w:top w:w="80" w:type="dxa"/>
+              <w:start w:w="120" w:type="dxa"/>
+              <w:bottom w:w="80" w:type="dxa"/>
+              <w:end w:w="120" w:type="dxa"/>
+            </w:tcMar>
+            <w:vAlign w:val="center"/>
+          </w:tcPr>
+          <w:p>
+            <w:pPr>
+              <w:spacing w:before="0" w:after="40" w:line="252" w:lineRule="auto"/>
+              <w:jc w:val="left"/>
+            </w:pPr>
+            <w:r>
+              <w:rPr>
+                <w:rFonts w:ascii="Calibri" w:hAnsi="Calibri" w:eastAsia="Microsoft YaHei"/>
+                <w:b w:val="0"/>
+                <w:i w:val="0"/>
+                <w:color w:val="1F1F1F"/>
+                <w:sz w:val="18"/>
+              </w:rPr>
+              <w:t>High-frequency/local detail</w:t>
+            </w:r>
+          </w:p>
+        </w:tc>
+        <w:tc>
+          <w:tcPr>
+            <w:tcW w:type="dxa" w:w="2350"/>
+            <w:tcMar>
+              <w:top w:w="80" w:type="dxa"/>
+              <w:start w:w="120" w:type="dxa"/>
+              <w:bottom w:w="80" w:type="dxa"/>
+              <w:end w:w="120" w:type="dxa"/>
+            </w:tcMar>
+            <w:vAlign w:val="center"/>
+          </w:tcPr>
+          <w:p>
+            <w:pPr>
+              <w:spacing w:before="0" w:after="40" w:line="252" w:lineRule="auto"/>
+              <w:jc w:val="left"/>
+            </w:pPr>
+            <w:r>
+              <w:rPr>
+                <w:rFonts w:ascii="Calibri" w:hAnsi="Calibri" w:eastAsia="Microsoft YaHei"/>
+                <w:b w:val="0"/>
+                <w:i w:val="0"/>
+                <w:color w:val="1F1F1F"/>
+                <w:sz w:val="18"/>
+              </w:rPr>
+              <w:t>每个 spectral block 后有 pointwise MLP，且 Fourier kernel 覆盖完整频率网格。</w:t>
+            </w:r>
+          </w:p>
+        </w:tc>
+        <w:tc>
+          <w:tcPr>
+            <w:tcW w:type="dxa" w:w="2350"/>
+            <w:tcMar>
+              <w:top w:w="80" w:type="dxa"/>
+              <w:start w:w="120" w:type="dxa"/>
+              <w:bottom w:w="80" w:type="dxa"/>
+              <w:end w:w="120" w:type="dxa"/>
+            </w:tcMar>
+            <w:vAlign w:val="center"/>
+          </w:tcPr>
+          <w:p>
+            <w:pPr>
+              <w:spacing w:before="0" w:after="40" w:line="252" w:lineRule="auto"/>
+              <w:jc w:val="left"/>
+            </w:pPr>
+            <w:r>
+              <w:rPr>
+                <w:rFonts w:ascii="Calibri" w:hAnsi="Calibri" w:eastAsia="Microsoft YaHei"/>
+                <w:b w:val="0"/>
+                <w:i w:val="0"/>
+                <w:color w:val="1F1F1F"/>
+                <w:sz w:val="18"/>
+              </w:rPr>
+              <w:t xml:space="preserve">仅保留 </w:t>
+            </w:r>
+            <w:r>
+              <w:rPr>
+                <w:rFonts w:ascii="Consolas" w:hAnsi="Consolas" w:eastAsia="Microsoft YaHei"/>
+                <w:b w:val="0"/>
+                <w:i w:val="0"/>
+                <w:color w:val="333333"/>
+                <w:sz w:val="18"/>
+              </w:rPr>
+              <w:t>modes=16</w:t>
+            </w:r>
+            <w:r>
+              <w:rPr>
+                <w:rFonts w:ascii="Calibri" w:hAnsi="Calibri" w:eastAsia="Microsoft YaHei"/>
+                <w:b w:val="0"/>
+                <w:i w:val="0"/>
+                <w:color w:val="1F1F1F"/>
+                <w:sz w:val="18"/>
+              </w:rPr>
+              <w:t xml:space="preserve"> 的低频 Koopman matrix，另有 1x1 conv high-frequency complement。</w:t>
+            </w:r>
+          </w:p>
+        </w:tc>
+        <w:tc>
+          <w:tcPr>
+            <w:tcW w:type="dxa" w:w="2960"/>
+            <w:tcMar>
+              <w:top w:w="80" w:type="dxa"/>
+              <w:start w:w="120" w:type="dxa"/>
+              <w:bottom w:w="80" w:type="dxa"/>
+              <w:end w:w="120" w:type="dxa"/>
+            </w:tcMar>
+            <w:vAlign w:val="center"/>
+          </w:tcPr>
+          <w:p>
+            <w:pPr>
+              <w:spacing w:before="0" w:after="40" w:line="252" w:lineRule="auto"/>
+              <w:jc w:val="left"/>
+            </w:pPr>
+            <w:r>
+              <w:rPr>
+                <w:rFonts w:ascii="Calibri" w:hAnsi="Calibri" w:eastAsia="Microsoft YaHei"/>
+                <w:b w:val="0"/>
+                <w:i w:val="0"/>
+                <w:color w:val="1F1F1F"/>
+                <w:sz w:val="18"/>
+              </w:rPr>
+              <w:t>CFD-2D 的局部高频和变量耦合更复杂，KNO 的高频补偿能力不足。</w:t>
+            </w:r>
+          </w:p>
+        </w:tc>
+      </w:tr>
+      <w:tr>
+        <w:tc>
+          <w:tcPr>
+            <w:tcW w:type="dxa" w:w="1700"/>
+            <w:tcMar>
+              <w:top w:w="80" w:type="dxa"/>
+              <w:start w:w="120" w:type="dxa"/>
+              <w:bottom w:w="80" w:type="dxa"/>
+              <w:end w:w="120" w:type="dxa"/>
+            </w:tcMar>
+            <w:vAlign w:val="center"/>
+          </w:tcPr>
+          <w:p>
+            <w:pPr>
+              <w:spacing w:before="0" w:after="40" w:line="252" w:lineRule="auto"/>
+              <w:jc w:val="center"/>
+            </w:pPr>
+            <w:r>
+              <w:rPr>
+                <w:rFonts w:ascii="Calibri" w:hAnsi="Calibri" w:eastAsia="Microsoft YaHei"/>
+                <w:b w:val="0"/>
+                <w:i w:val="0"/>
+                <w:color w:val="1F1F1F"/>
+                <w:sz w:val="18"/>
+              </w:rPr>
+              <w:t>Loss design</w:t>
+            </w:r>
+          </w:p>
+        </w:tc>
+        <w:tc>
+          <w:tcPr>
+            <w:tcW w:type="dxa" w:w="2350"/>
+            <w:tcMar>
+              <w:top w:w="80" w:type="dxa"/>
+              <w:start w:w="120" w:type="dxa"/>
+              <w:bottom w:w="80" w:type="dxa"/>
+              <w:end w:w="120" w:type="dxa"/>
+            </w:tcMar>
+            <w:vAlign w:val="center"/>
+          </w:tcPr>
+          <w:p>
+            <w:pPr>
+              <w:spacing w:before="0" w:after="40" w:line="252" w:lineRule="auto"/>
+              <w:jc w:val="left"/>
+            </w:pPr>
+            <w:r>
+              <w:rPr>
+                <w:rFonts w:ascii="Calibri" w:hAnsi="Calibri" w:eastAsia="Microsoft YaHei"/>
+                <w:b w:val="0"/>
+                <w:i w:val="0"/>
+                <w:color w:val="1F1F1F"/>
+                <w:sz w:val="18"/>
+              </w:rPr>
+              <w:t>主要优化预测 relative L2/rollout 任务。</w:t>
+            </w:r>
+          </w:p>
+        </w:tc>
+        <w:tc>
+          <w:tcPr>
+            <w:tcW w:type="dxa" w:w="2350"/>
+            <w:tcMar>
+              <w:top w:w="80" w:type="dxa"/>
+              <w:start w:w="120" w:type="dxa"/>
+              <w:bottom w:w="80" w:type="dxa"/>
+              <w:end w:w="120" w:type="dxa"/>
+            </w:tcMar>
+            <w:vAlign w:val="center"/>
+          </w:tcPr>
+          <w:p>
+            <w:pPr>
+              <w:spacing w:before="0" w:after="40" w:line="252" w:lineRule="auto"/>
+              <w:jc w:val="left"/>
+            </w:pPr>
+            <w:r>
+              <w:rPr>
+                <w:rFonts w:ascii="Calibri" w:hAnsi="Calibri" w:eastAsia="Microsoft YaHei"/>
+                <w:b w:val="0"/>
+                <w:i w:val="0"/>
+                <w:color w:val="1F1F1F"/>
+                <w:sz w:val="18"/>
+              </w:rPr>
+              <w:t xml:space="preserve">使用 </w:t>
+            </w:r>
+            <w:r>
+              <w:rPr>
+                <w:rFonts w:ascii="Consolas" w:hAnsi="Consolas" w:eastAsia="Microsoft YaHei"/>
+                <w:b w:val="0"/>
+                <w:i w:val="0"/>
+                <w:color w:val="333333"/>
+                <w:sz w:val="18"/>
+              </w:rPr>
+              <w:t>5 * prediction_mse + 0.5 * reconstruction_mse</w:t>
+            </w:r>
+            <w:r>
+              <w:rPr>
+                <w:rFonts w:ascii="Calibri" w:hAnsi="Calibri" w:eastAsia="Microsoft YaHei"/>
+                <w:b w:val="0"/>
+                <w:i w:val="0"/>
+                <w:color w:val="1F1F1F"/>
+                <w:sz w:val="18"/>
+              </w:rPr>
+              <w:t>，还要约束观测空间可重构。</w:t>
+            </w:r>
+          </w:p>
+        </w:tc>
+        <w:tc>
+          <w:tcPr>
+            <w:tcW w:type="dxa" w:w="2960"/>
+            <w:tcMar>
+              <w:top w:w="80" w:type="dxa"/>
+              <w:start w:w="120" w:type="dxa"/>
+              <w:bottom w:w="80" w:type="dxa"/>
+              <w:end w:w="120" w:type="dxa"/>
+            </w:tcMar>
+            <w:vAlign w:val="center"/>
+          </w:tcPr>
+          <w:p>
+            <w:pPr>
+              <w:spacing w:before="0" w:after="40" w:line="252" w:lineRule="auto"/>
+              <w:jc w:val="left"/>
+            </w:pPr>
+            <w:r>
+              <w:rPr>
+                <w:rFonts w:ascii="Calibri" w:hAnsi="Calibri" w:eastAsia="Microsoft YaHei"/>
+                <w:b w:val="0"/>
+                <w:i w:val="0"/>
+                <w:color w:val="1F1F1F"/>
+                <w:sz w:val="18"/>
+              </w:rPr>
+              <w:t>reconstruction loss 有助于 KNO 表示稳定，但也会占用容量；CFD 精度任务上不一定最优。</w:t>
+            </w:r>
+          </w:p>
+        </w:tc>
+      </w:tr>
+    </w:tbl>
+    <w:p/>
+    <w:p>
+      <w:pPr>
+        <w:spacing w:before="0" w:after="120" w:line="264" w:lineRule="auto"/>
+      </w:pPr>
+      <w:r>
+        <w:rPr>
+          <w:rFonts w:ascii="Calibri" w:hAnsi="Calibri" w:eastAsia="Microsoft YaHei"/>
+          <w:b w:val="0"/>
+          <w:i w:val="0"/>
+          <w:color w:val="1F1F1F"/>
+          <w:sz w:val="22"/>
+        </w:rPr>
+        <w:t xml:space="preserve">参数量与训练成本对比如下。AM-FNO 数字来自本地复现 summary 日志，KNO 数字来自本项目 </w:t>
+      </w:r>
+      <w:r>
+        <w:rPr>
+          <w:rFonts w:ascii="Consolas" w:hAnsi="Consolas" w:eastAsia="Microsoft YaHei"/>
+          <w:b w:val="0"/>
+          <w:i w:val="0"/>
+          <w:color w:val="333333"/>
+          <w:sz w:val="19"/>
+        </w:rPr>
+        <w:t>outputs/*/env.txt</w:t>
+      </w:r>
+      <w:r>
+        <w:rPr>
+          <w:rFonts w:ascii="Calibri" w:hAnsi="Calibri" w:eastAsia="Microsoft YaHei"/>
+          <w:b w:val="0"/>
+          <w:i w:val="0"/>
+          <w:color w:val="1F1F1F"/>
+          <w:sz w:val="22"/>
+        </w:rPr>
+        <w:t xml:space="preserve"> 与 </w:t>
+      </w:r>
+      <w:r>
+        <w:rPr>
+          <w:rFonts w:ascii="Consolas" w:hAnsi="Consolas" w:eastAsia="Microsoft YaHei"/>
+          <w:b w:val="0"/>
+          <w:i w:val="0"/>
+          <w:color w:val="333333"/>
+          <w:sz w:val="19"/>
+        </w:rPr>
+        <w:t>metrics.csv</w:t>
+      </w:r>
+      <w:r>
+        <w:rPr>
+          <w:rFonts w:ascii="Calibri" w:hAnsi="Calibri" w:eastAsia="Microsoft YaHei"/>
+          <w:b w:val="0"/>
+          <w:i w:val="0"/>
+          <w:color w:val="1F1F1F"/>
+          <w:sz w:val="22"/>
+        </w:rPr>
+        <w:t>。</w:t>
+      </w:r>
+    </w:p>
+    <w:tbl>
+      <w:tblPr>
+        <w:tblStyle w:val="TableGrid"/>
+        <w:tblW w:type="dxa" w:w="9160"/>
+        <w:tblLayout w:type="fixed"/>
+        <w:tblLook w:firstColumn="1" w:firstRow="1" w:lastColumn="0" w:lastRow="0" w:noHBand="0" w:noVBand="1" w:val="04A0"/>
+        <w:tblInd w:w="120" w:type="dxa"/>
+        <w:tblBorders>
+          <w:top w:val="single" w:sz="4" w:space="0" w:color="D9E2EC"/>
+          <w:left w:val="single" w:sz="4" w:space="0" w:color="D9E2EC"/>
+          <w:bottom w:val="single" w:sz="4" w:space="0" w:color="D9E2EC"/>
+          <w:right w:val="single" w:sz="4" w:space="0" w:color="D9E2EC"/>
+          <w:insideH w:val="single" w:sz="4" w:space="0" w:color="D9E2EC"/>
+          <w:insideV w:val="single" w:sz="4" w:space="0" w:color="D9E2EC"/>
+        </w:tblBorders>
+      </w:tblPr>
+      <w:tblGrid>
+        <w:gridCol w:w="1000"/>
+        <w:gridCol w:w="2350"/>
+        <w:gridCol w:w="900"/>
+        <w:gridCol w:w="1100"/>
+        <w:gridCol w:w="1200"/>
+        <w:gridCol w:w="1200"/>
+        <w:gridCol w:w="1410"/>
+      </w:tblGrid>
+      <w:tr>
+        <w:trPr>
+          <w:tblHeader w:val="true"/>
+        </w:trPr>
+        <w:tc>
+          <w:tcPr>
+            <w:tcW w:type="dxa" w:w="1000"/>
+            <w:tcMar>
+              <w:top w:w="80" w:type="dxa"/>
+              <w:start w:w="120" w:type="dxa"/>
+              <w:bottom w:w="80" w:type="dxa"/>
+              <w:end w:w="120" w:type="dxa"/>
+            </w:tcMar>
+            <w:vAlign w:val="center"/>
+            <w:shd w:fill="F2F4F7"/>
+          </w:tcPr>
+          <w:p>
+            <w:pPr>
+              <w:spacing w:before="0" w:after="40" w:line="252" w:lineRule="auto"/>
+              <w:jc w:val="center"/>
+            </w:pPr>
+            <w:r>
+              <w:rPr>
+                <w:rFonts w:ascii="Calibri" w:hAnsi="Calibri" w:eastAsia="Microsoft YaHei"/>
+                <w:b/>
+                <w:i w:val="0"/>
+                <w:color w:val="202A35"/>
+                <w:sz w:val="18"/>
+              </w:rPr>
+              <w:t>Benchmark</w:t>
+            </w:r>
+          </w:p>
+        </w:tc>
+        <w:tc>
+          <w:tcPr>
+            <w:tcW w:type="dxa" w:w="2350"/>
+            <w:tcMar>
+              <w:top w:w="80" w:type="dxa"/>
+              <w:start w:w="120" w:type="dxa"/>
+              <w:bottom w:w="80" w:type="dxa"/>
+              <w:end w:w="120" w:type="dxa"/>
+            </w:tcMar>
+            <w:vAlign w:val="center"/>
+            <w:shd w:fill="F2F4F7"/>
+          </w:tcPr>
+          <w:p>
+            <w:pPr>
+              <w:spacing w:before="0" w:after="40" w:line="252" w:lineRule="auto"/>
+              <w:jc w:val="center"/>
+            </w:pPr>
+            <w:r>
+              <w:rPr>
+                <w:rFonts w:ascii="Calibri" w:hAnsi="Calibri" w:eastAsia="Microsoft YaHei"/>
+                <w:b/>
+                <w:i w:val="0"/>
+                <w:color w:val="202A35"/>
+                <w:sz w:val="18"/>
+              </w:rPr>
+              <w:t>AM-FNO Params</w:t>
+            </w:r>
+          </w:p>
+        </w:tc>
+        <w:tc>
+          <w:tcPr>
+            <w:tcW w:type="dxa" w:w="900"/>
+            <w:tcMar>
+              <w:top w:w="80" w:type="dxa"/>
+              <w:start w:w="120" w:type="dxa"/>
+              <w:bottom w:w="80" w:type="dxa"/>
+              <w:end w:w="120" w:type="dxa"/>
+            </w:tcMar>
+            <w:vAlign w:val="center"/>
+            <w:shd w:fill="F2F4F7"/>
+          </w:tcPr>
+          <w:p>
+            <w:pPr>
+              <w:spacing w:before="0" w:after="40" w:line="252" w:lineRule="auto"/>
+              <w:jc w:val="center"/>
+            </w:pPr>
+            <w:r>
+              <w:rPr>
+                <w:rFonts w:ascii="Calibri" w:hAnsi="Calibri" w:eastAsia="Microsoft YaHei"/>
+                <w:b/>
+                <w:i w:val="0"/>
+                <w:color w:val="202A35"/>
+                <w:sz w:val="18"/>
+              </w:rPr>
+              <w:t>KNO Params</w:t>
+            </w:r>
+          </w:p>
+        </w:tc>
+        <w:tc>
+          <w:tcPr>
+            <w:tcW w:type="dxa" w:w="1100"/>
+            <w:tcMar>
+              <w:top w:w="80" w:type="dxa"/>
+              <w:start w:w="120" w:type="dxa"/>
+              <w:bottom w:w="80" w:type="dxa"/>
+              <w:end w:w="120" w:type="dxa"/>
+            </w:tcMar>
+            <w:vAlign w:val="center"/>
+            <w:shd w:fill="F2F4F7"/>
+          </w:tcPr>
+          <w:p>
+            <w:pPr>
+              <w:spacing w:before="0" w:after="40" w:line="252" w:lineRule="auto"/>
+              <w:jc w:val="center"/>
+            </w:pPr>
+            <w:r>
+              <w:rPr>
+                <w:rFonts w:ascii="Calibri" w:hAnsi="Calibri" w:eastAsia="Microsoft YaHei"/>
+                <w:b/>
+                <w:i w:val="0"/>
+                <w:color w:val="202A35"/>
+                <w:sz w:val="18"/>
+              </w:rPr>
+              <w:t>Param Ratio</w:t>
+            </w:r>
+          </w:p>
+        </w:tc>
+        <w:tc>
+          <w:tcPr>
+            <w:tcW w:type="dxa" w:w="1200"/>
+            <w:tcMar>
+              <w:top w:w="80" w:type="dxa"/>
+              <w:start w:w="120" w:type="dxa"/>
+              <w:bottom w:w="80" w:type="dxa"/>
+              <w:end w:w="120" w:type="dxa"/>
+            </w:tcMar>
+            <w:vAlign w:val="center"/>
+            <w:shd w:fill="F2F4F7"/>
+          </w:tcPr>
+          <w:p>
+            <w:pPr>
+              <w:spacing w:before="0" w:after="40" w:line="252" w:lineRule="auto"/>
+              <w:jc w:val="center"/>
+            </w:pPr>
+            <w:r>
+              <w:rPr>
+                <w:rFonts w:ascii="Calibri" w:hAnsi="Calibri" w:eastAsia="Microsoft YaHei"/>
+                <w:b/>
+                <w:i w:val="0"/>
+                <w:color w:val="202A35"/>
+                <w:sz w:val="18"/>
+              </w:rPr>
+              <w:t>AM-FNO Avg Sec/Epoch</w:t>
+            </w:r>
+          </w:p>
+        </w:tc>
+        <w:tc>
+          <w:tcPr>
+            <w:tcW w:type="dxa" w:w="1200"/>
+            <w:tcMar>
+              <w:top w:w="80" w:type="dxa"/>
+              <w:start w:w="120" w:type="dxa"/>
+              <w:bottom w:w="80" w:type="dxa"/>
+              <w:end w:w="120" w:type="dxa"/>
+            </w:tcMar>
+            <w:vAlign w:val="center"/>
+            <w:shd w:fill="F2F4F7"/>
+          </w:tcPr>
+          <w:p>
+            <w:pPr>
+              <w:spacing w:before="0" w:after="40" w:line="252" w:lineRule="auto"/>
+              <w:jc w:val="center"/>
+            </w:pPr>
+            <w:r>
+              <w:rPr>
+                <w:rFonts w:ascii="Calibri" w:hAnsi="Calibri" w:eastAsia="Microsoft YaHei"/>
+                <w:b/>
+                <w:i w:val="0"/>
+                <w:color w:val="202A35"/>
+                <w:sz w:val="18"/>
+              </w:rPr>
+              <w:t>KNO Avg Sec/Epoch</w:t>
+            </w:r>
+          </w:p>
+        </w:tc>
+        <w:tc>
+          <w:tcPr>
+            <w:tcW w:type="dxa" w:w="1410"/>
+            <w:tcMar>
+              <w:top w:w="80" w:type="dxa"/>
+              <w:start w:w="120" w:type="dxa"/>
+              <w:bottom w:w="80" w:type="dxa"/>
+              <w:end w:w="120" w:type="dxa"/>
+            </w:tcMar>
+            <w:vAlign w:val="center"/>
+            <w:shd w:fill="F2F4F7"/>
+          </w:tcPr>
+          <w:p>
+            <w:pPr>
+              <w:spacing w:before="0" w:after="40" w:line="252" w:lineRule="auto"/>
+              <w:jc w:val="center"/>
+            </w:pPr>
+            <w:r>
+              <w:rPr>
+                <w:rFonts w:ascii="Calibri" w:hAnsi="Calibri" w:eastAsia="Microsoft YaHei"/>
+                <w:b/>
+                <w:i w:val="0"/>
+                <w:color w:val="202A35"/>
+                <w:sz w:val="18"/>
+              </w:rPr>
+              <w:t>Cost Observation</w:t>
+            </w:r>
+          </w:p>
+        </w:tc>
+      </w:tr>
+      <w:tr>
+        <w:tc>
+          <w:tcPr>
+            <w:tcW w:type="dxa" w:w="1000"/>
+            <w:tcMar>
+              <w:top w:w="80" w:type="dxa"/>
+              <w:start w:w="120" w:type="dxa"/>
+              <w:bottom w:w="80" w:type="dxa"/>
+              <w:end w:w="120" w:type="dxa"/>
+            </w:tcMar>
+            <w:vAlign w:val="center"/>
+          </w:tcPr>
+          <w:p>
+            <w:pPr>
+              <w:spacing w:before="0" w:after="40" w:line="252" w:lineRule="auto"/>
+              <w:jc w:val="center"/>
+            </w:pPr>
+            <w:r>
+              <w:rPr>
+                <w:rFonts w:ascii="Calibri" w:hAnsi="Calibri" w:eastAsia="Microsoft YaHei"/>
+                <w:b w:val="0"/>
+                <w:i w:val="0"/>
+                <w:color w:val="1F1F1F"/>
+                <w:sz w:val="18"/>
+              </w:rPr>
+              <w:t>NS-2D v1e-4</w:t>
+            </w:r>
+          </w:p>
+        </w:tc>
+        <w:tc>
+          <w:tcPr>
+            <w:tcW w:type="dxa" w:w="2350"/>
+            <w:tcMar>
+              <w:top w:w="80" w:type="dxa"/>
+              <w:start w:w="120" w:type="dxa"/>
+              <w:bottom w:w="80" w:type="dxa"/>
+              <w:end w:w="120" w:type="dxa"/>
+            </w:tcMar>
+            <w:vAlign w:val="center"/>
+          </w:tcPr>
+          <w:p>
+            <w:pPr>
+              <w:spacing w:before="0" w:after="40" w:line="252" w:lineRule="auto"/>
+              <w:jc w:val="center"/>
+            </w:pPr>
+            <w:r>
+              <w:rPr>
+                <w:rFonts w:ascii="Calibri" w:hAnsi="Calibri" w:eastAsia="Microsoft YaHei"/>
+                <w:b w:val="0"/>
+                <w:i w:val="0"/>
+                <w:color w:val="1F1F1F"/>
+                <w:sz w:val="18"/>
+              </w:rPr>
+              <w:t>1,136,929</w:t>
+            </w:r>
+          </w:p>
+        </w:tc>
+        <w:tc>
+          <w:tcPr>
+            <w:tcW w:type="dxa" w:w="900"/>
+            <w:tcMar>
+              <w:top w:w="80" w:type="dxa"/>
+              <w:start w:w="120" w:type="dxa"/>
+              <w:bottom w:w="80" w:type="dxa"/>
+              <w:end w:w="120" w:type="dxa"/>
+            </w:tcMar>
+            <w:vAlign w:val="center"/>
+          </w:tcPr>
+          <w:p>
+            <w:pPr>
+              <w:spacing w:before="0" w:after="40" w:line="252" w:lineRule="auto"/>
+              <w:jc w:val="center"/>
+            </w:pPr>
+            <w:r>
+              <w:rPr>
+                <w:rFonts w:ascii="Calibri" w:hAnsi="Calibri" w:eastAsia="Microsoft YaHei"/>
+                <w:b w:val="0"/>
+                <w:i w:val="0"/>
+                <w:color w:val="1F1F1F"/>
+                <w:sz w:val="18"/>
+              </w:rPr>
+              <w:t>526,059</w:t>
+            </w:r>
+          </w:p>
+        </w:tc>
+        <w:tc>
+          <w:tcPr>
+            <w:tcW w:type="dxa" w:w="1100"/>
+            <w:tcMar>
+              <w:top w:w="80" w:type="dxa"/>
+              <w:start w:w="120" w:type="dxa"/>
+              <w:bottom w:w="80" w:type="dxa"/>
+              <w:end w:w="120" w:type="dxa"/>
+            </w:tcMar>
+            <w:vAlign w:val="center"/>
+          </w:tcPr>
+          <w:p>
+            <w:pPr>
+              <w:spacing w:before="0" w:after="40" w:line="252" w:lineRule="auto"/>
+              <w:jc w:val="center"/>
+            </w:pPr>
+            <w:r>
+              <w:rPr>
+                <w:rFonts w:ascii="Calibri" w:hAnsi="Calibri" w:eastAsia="Microsoft YaHei"/>
+                <w:b w:val="0"/>
+                <w:i w:val="0"/>
+                <w:color w:val="1F1F1F"/>
+                <w:sz w:val="18"/>
+              </w:rPr>
+              <w:t>AM-FNO 2.16x KNO</w:t>
+            </w:r>
+          </w:p>
+        </w:tc>
+        <w:tc>
+          <w:tcPr>
+            <w:tcW w:type="dxa" w:w="1200"/>
+            <w:tcMar>
+              <w:top w:w="80" w:type="dxa"/>
+              <w:start w:w="120" w:type="dxa"/>
+              <w:bottom w:w="80" w:type="dxa"/>
+              <w:end w:w="120" w:type="dxa"/>
+            </w:tcMar>
+            <w:vAlign w:val="center"/>
+          </w:tcPr>
+          <w:p>
+            <w:pPr>
+              <w:spacing w:before="0" w:after="40" w:line="252" w:lineRule="auto"/>
+              <w:jc w:val="center"/>
+            </w:pPr>
+            <w:r>
+              <w:rPr>
+                <w:rFonts w:ascii="Calibri" w:hAnsi="Calibri" w:eastAsia="Microsoft YaHei"/>
+                <w:b w:val="0"/>
+                <w:i w:val="0"/>
+                <w:color w:val="1F1F1F"/>
+                <w:sz w:val="18"/>
+              </w:rPr>
+              <w:t>11.06</w:t>
+            </w:r>
+          </w:p>
+        </w:tc>
+        <w:tc>
+          <w:tcPr>
+            <w:tcW w:type="dxa" w:w="1200"/>
+            <w:tcMar>
+              <w:top w:w="80" w:type="dxa"/>
+              <w:start w:w="120" w:type="dxa"/>
+              <w:bottom w:w="80" w:type="dxa"/>
+              <w:end w:w="120" w:type="dxa"/>
+            </w:tcMar>
+            <w:vAlign w:val="center"/>
+          </w:tcPr>
+          <w:p>
+            <w:pPr>
+              <w:spacing w:before="0" w:after="40" w:line="252" w:lineRule="auto"/>
+              <w:jc w:val="center"/>
+            </w:pPr>
+            <w:r>
+              <w:rPr>
+                <w:rFonts w:ascii="Calibri" w:hAnsi="Calibri" w:eastAsia="Microsoft YaHei"/>
+                <w:b w:val="0"/>
+                <w:i w:val="0"/>
+                <w:color w:val="1F1F1F"/>
+                <w:sz w:val="18"/>
+              </w:rPr>
+              <w:t>14.48</w:t>
+            </w:r>
+          </w:p>
+        </w:tc>
+        <w:tc>
+          <w:tcPr>
+            <w:tcW w:type="dxa" w:w="1410"/>
+            <w:tcMar>
+              <w:top w:w="80" w:type="dxa"/>
+              <w:start w:w="120" w:type="dxa"/>
+              <w:bottom w:w="80" w:type="dxa"/>
+              <w:end w:w="120" w:type="dxa"/>
+            </w:tcMar>
+            <w:vAlign w:val="center"/>
+          </w:tcPr>
+          <w:p>
+            <w:pPr>
+              <w:spacing w:before="0" w:after="40" w:line="252" w:lineRule="auto"/>
+              <w:jc w:val="left"/>
+            </w:pPr>
+            <w:r>
+              <w:rPr>
+                <w:rFonts w:ascii="Calibri" w:hAnsi="Calibri" w:eastAsia="Microsoft YaHei"/>
+                <w:b w:val="0"/>
+                <w:i w:val="0"/>
+                <w:color w:val="1F1F1F"/>
+                <w:sz w:val="18"/>
+              </w:rPr>
+              <w:t>KNO 参数更少但略慢，主要由于自回归 rollout 和复数 Koopman 操作。</w:t>
+            </w:r>
+          </w:p>
+        </w:tc>
+      </w:tr>
+      <w:tr>
+        <w:tc>
+          <w:tcPr>
+            <w:tcW w:type="dxa" w:w="1000"/>
+            <w:tcMar>
+              <w:top w:w="80" w:type="dxa"/>
+              <w:start w:w="120" w:type="dxa"/>
+              <w:bottom w:w="80" w:type="dxa"/>
+              <w:end w:w="120" w:type="dxa"/>
+            </w:tcMar>
+            <w:vAlign w:val="center"/>
+          </w:tcPr>
+          <w:p>
+            <w:pPr>
+              <w:spacing w:before="0" w:after="40" w:line="252" w:lineRule="auto"/>
+              <w:jc w:val="center"/>
+            </w:pPr>
+            <w:r>
+              <w:rPr>
+                <w:rFonts w:ascii="Calibri" w:hAnsi="Calibri" w:eastAsia="Microsoft YaHei"/>
+                <w:b w:val="0"/>
+                <w:i w:val="0"/>
+                <w:color w:val="1F1F1F"/>
+                <w:sz w:val="18"/>
+              </w:rPr>
+              <w:t>CFD-1D</w:t>
+            </w:r>
+          </w:p>
+        </w:tc>
+        <w:tc>
+          <w:tcPr>
+            <w:tcW w:type="dxa" w:w="2350"/>
+            <w:tcMar>
+              <w:top w:w="80" w:type="dxa"/>
+              <w:start w:w="120" w:type="dxa"/>
+              <w:bottom w:w="80" w:type="dxa"/>
+              <w:end w:w="120" w:type="dxa"/>
+            </w:tcMar>
+            <w:vAlign w:val="center"/>
+          </w:tcPr>
+          <w:p>
+            <w:pPr>
+              <w:spacing w:before="0" w:after="40" w:line="252" w:lineRule="auto"/>
+              <w:jc w:val="center"/>
+            </w:pPr>
+            <w:r>
+              <w:rPr>
+                <w:rFonts w:ascii="Calibri" w:hAnsi="Calibri" w:eastAsia="Microsoft YaHei"/>
+                <w:b w:val="0"/>
+                <w:i w:val="0"/>
+                <w:color w:val="1F1F1F"/>
+                <w:sz w:val="18"/>
+              </w:rPr>
+              <w:t>588,419</w:t>
+            </w:r>
+          </w:p>
+        </w:tc>
+        <w:tc>
+          <w:tcPr>
+            <w:tcW w:type="dxa" w:w="900"/>
+            <w:tcMar>
+              <w:top w:w="80" w:type="dxa"/>
+              <w:start w:w="120" w:type="dxa"/>
+              <w:bottom w:w="80" w:type="dxa"/>
+              <w:end w:w="120" w:type="dxa"/>
+            </w:tcMar>
+            <w:vAlign w:val="center"/>
+          </w:tcPr>
+          <w:p>
+            <w:pPr>
+              <w:spacing w:before="0" w:after="40" w:line="252" w:lineRule="auto"/>
+              <w:jc w:val="center"/>
+            </w:pPr>
+            <w:r>
+              <w:rPr>
+                <w:rFonts w:ascii="Calibri" w:hAnsi="Calibri" w:eastAsia="Microsoft YaHei"/>
+                <w:b w:val="0"/>
+                <w:i w:val="0"/>
+                <w:color w:val="1F1F1F"/>
+                <w:sz w:val="18"/>
+              </w:rPr>
+              <w:t>35,905</w:t>
+            </w:r>
+          </w:p>
+        </w:tc>
+        <w:tc>
+          <w:tcPr>
+            <w:tcW w:type="dxa" w:w="1100"/>
+            <w:tcMar>
+              <w:top w:w="80" w:type="dxa"/>
+              <w:start w:w="120" w:type="dxa"/>
+              <w:bottom w:w="80" w:type="dxa"/>
+              <w:end w:w="120" w:type="dxa"/>
+            </w:tcMar>
+            <w:vAlign w:val="center"/>
+          </w:tcPr>
+          <w:p>
+            <w:pPr>
+              <w:spacing w:before="0" w:after="40" w:line="252" w:lineRule="auto"/>
+              <w:jc w:val="center"/>
+            </w:pPr>
+            <w:r>
+              <w:rPr>
+                <w:rFonts w:ascii="Calibri" w:hAnsi="Calibri" w:eastAsia="Microsoft YaHei"/>
+                <w:b w:val="0"/>
+                <w:i w:val="0"/>
+                <w:color w:val="1F1F1F"/>
+                <w:sz w:val="18"/>
+              </w:rPr>
+              <w:t>AM-FNO 16.39x KNO</w:t>
+            </w:r>
+          </w:p>
+        </w:tc>
+        <w:tc>
+          <w:tcPr>
+            <w:tcW w:type="dxa" w:w="1200"/>
+            <w:tcMar>
+              <w:top w:w="80" w:type="dxa"/>
+              <w:start w:w="120" w:type="dxa"/>
+              <w:bottom w:w="80" w:type="dxa"/>
+              <w:end w:w="120" w:type="dxa"/>
+            </w:tcMar>
+            <w:vAlign w:val="center"/>
+          </w:tcPr>
+          <w:p>
+            <w:pPr>
+              <w:spacing w:before="0" w:after="40" w:line="252" w:lineRule="auto"/>
+              <w:jc w:val="center"/>
+            </w:pPr>
+            <w:r>
+              <w:rPr>
+                <w:rFonts w:ascii="Calibri" w:hAnsi="Calibri" w:eastAsia="Microsoft YaHei"/>
+                <w:b w:val="0"/>
+                <w:i w:val="0"/>
+                <w:color w:val="1F1F1F"/>
+                <w:sz w:val="18"/>
+              </w:rPr>
+              <w:t>9.34</w:t>
+            </w:r>
+          </w:p>
+        </w:tc>
+        <w:tc>
+          <w:tcPr>
+            <w:tcW w:type="dxa" w:w="1200"/>
+            <w:tcMar>
+              <w:top w:w="80" w:type="dxa"/>
+              <w:start w:w="120" w:type="dxa"/>
+              <w:bottom w:w="80" w:type="dxa"/>
+              <w:end w:w="120" w:type="dxa"/>
+            </w:tcMar>
+            <w:vAlign w:val="center"/>
+          </w:tcPr>
+          <w:p>
+            <w:pPr>
+              <w:spacing w:before="0" w:after="40" w:line="252" w:lineRule="auto"/>
+              <w:jc w:val="center"/>
+            </w:pPr>
+            <w:r>
+              <w:rPr>
+                <w:rFonts w:ascii="Calibri" w:hAnsi="Calibri" w:eastAsia="Microsoft YaHei"/>
+                <w:b w:val="0"/>
+                <w:i w:val="0"/>
+                <w:color w:val="1F1F1F"/>
+                <w:sz w:val="18"/>
+              </w:rPr>
+              <w:t>8.45</w:t>
+            </w:r>
+          </w:p>
+        </w:tc>
+        <w:tc>
+          <w:tcPr>
+            <w:tcW w:type="dxa" w:w="1410"/>
+            <w:tcMar>
+              <w:top w:w="80" w:type="dxa"/>
+              <w:start w:w="120" w:type="dxa"/>
+              <w:bottom w:w="80" w:type="dxa"/>
+              <w:end w:w="120" w:type="dxa"/>
+            </w:tcMar>
+            <w:vAlign w:val="center"/>
+          </w:tcPr>
+          <w:p>
+            <w:pPr>
+              <w:spacing w:before="0" w:after="40" w:line="252" w:lineRule="auto"/>
+              <w:jc w:val="left"/>
+            </w:pPr>
+            <w:r>
+              <w:rPr>
+                <w:rFonts w:ascii="Calibri" w:hAnsi="Calibri" w:eastAsia="Microsoft YaHei"/>
+                <w:b w:val="0"/>
+                <w:i w:val="0"/>
+                <w:color w:val="1F1F1F"/>
+                <w:sz w:val="18"/>
+              </w:rPr>
+              <w:t>KNO 极小模型已可稳定训练，但容量明显不足，精度约差 2.3x。</w:t>
+            </w:r>
+          </w:p>
+        </w:tc>
+      </w:tr>
+      <w:tr>
+        <w:tc>
+          <w:tcPr>
+            <w:tcW w:type="dxa" w:w="1000"/>
+            <w:tcMar>
+              <w:top w:w="80" w:type="dxa"/>
+              <w:start w:w="120" w:type="dxa"/>
+              <w:bottom w:w="80" w:type="dxa"/>
+              <w:end w:w="120" w:type="dxa"/>
+            </w:tcMar>
+            <w:vAlign w:val="center"/>
+          </w:tcPr>
+          <w:p>
+            <w:pPr>
+              <w:spacing w:before="0" w:after="40" w:line="252" w:lineRule="auto"/>
+              <w:jc w:val="center"/>
+            </w:pPr>
+            <w:r>
+              <w:rPr>
+                <w:rFonts w:ascii="Calibri" w:hAnsi="Calibri" w:eastAsia="Microsoft YaHei"/>
+                <w:b w:val="0"/>
+                <w:i w:val="0"/>
+                <w:color w:val="1F1F1F"/>
+                <w:sz w:val="18"/>
+              </w:rPr>
+              <w:t>CFD-2D</w:t>
+            </w:r>
+          </w:p>
+        </w:tc>
+        <w:tc>
+          <w:tcPr>
+            <w:tcW w:type="dxa" w:w="2350"/>
+            <w:tcMar>
+              <w:top w:w="80" w:type="dxa"/>
+              <w:start w:w="120" w:type="dxa"/>
+              <w:bottom w:w="80" w:type="dxa"/>
+              <w:end w:w="120" w:type="dxa"/>
+            </w:tcMar>
+            <w:vAlign w:val="center"/>
+          </w:tcPr>
+          <w:p>
+            <w:pPr>
+              <w:spacing w:before="0" w:after="40" w:line="252" w:lineRule="auto"/>
+              <w:jc w:val="center"/>
+            </w:pPr>
+            <w:r>
+              <w:rPr>
+                <w:rFonts w:ascii="Calibri" w:hAnsi="Calibri" w:eastAsia="Microsoft YaHei"/>
+                <w:b w:val="0"/>
+                <w:i w:val="0"/>
+                <w:color w:val="1F1F1F"/>
+                <w:sz w:val="18"/>
+              </w:rPr>
+              <w:t>2,286,180</w:t>
+            </w:r>
+          </w:p>
+        </w:tc>
+        <w:tc>
+          <w:tcPr>
+            <w:tcW w:type="dxa" w:w="900"/>
+            <w:tcMar>
+              <w:top w:w="80" w:type="dxa"/>
+              <w:start w:w="120" w:type="dxa"/>
+              <w:bottom w:w="80" w:type="dxa"/>
+              <w:end w:w="120" w:type="dxa"/>
+            </w:tcMar>
+            <w:vAlign w:val="center"/>
+          </w:tcPr>
+          <w:p>
+            <w:pPr>
+              <w:spacing w:before="0" w:after="40" w:line="252" w:lineRule="auto"/>
+              <w:jc w:val="center"/>
+            </w:pPr>
+            <w:r>
+              <w:rPr>
+                <w:rFonts w:ascii="Calibri" w:hAnsi="Calibri" w:eastAsia="Microsoft YaHei"/>
+                <w:b w:val="0"/>
+                <w:i w:val="0"/>
+                <w:color w:val="1F1F1F"/>
+                <w:sz w:val="18"/>
+              </w:rPr>
+              <w:t>528,108</w:t>
+            </w:r>
+          </w:p>
+        </w:tc>
+        <w:tc>
+          <w:tcPr>
+            <w:tcW w:type="dxa" w:w="1100"/>
+            <w:tcMar>
+              <w:top w:w="80" w:type="dxa"/>
+              <w:start w:w="120" w:type="dxa"/>
+              <w:bottom w:w="80" w:type="dxa"/>
+              <w:end w:w="120" w:type="dxa"/>
+            </w:tcMar>
+            <w:vAlign w:val="center"/>
+          </w:tcPr>
+          <w:p>
+            <w:pPr>
+              <w:spacing w:before="0" w:after="40" w:line="252" w:lineRule="auto"/>
+              <w:jc w:val="center"/>
+            </w:pPr>
+            <w:r>
+              <w:rPr>
+                <w:rFonts w:ascii="Calibri" w:hAnsi="Calibri" w:eastAsia="Microsoft YaHei"/>
+                <w:b w:val="0"/>
+                <w:i w:val="0"/>
+                <w:color w:val="1F1F1F"/>
+                <w:sz w:val="18"/>
+              </w:rPr>
+              <w:t>AM-FNO 4.33x KNO</w:t>
+            </w:r>
+          </w:p>
+        </w:tc>
+        <w:tc>
+          <w:tcPr>
+            <w:tcW w:type="dxa" w:w="1200"/>
+            <w:tcMar>
+              <w:top w:w="80" w:type="dxa"/>
+              <w:start w:w="120" w:type="dxa"/>
+              <w:bottom w:w="80" w:type="dxa"/>
+              <w:end w:w="120" w:type="dxa"/>
+            </w:tcMar>
+            <w:vAlign w:val="center"/>
+          </w:tcPr>
+          <w:p>
+            <w:pPr>
+              <w:spacing w:before="0" w:after="40" w:line="252" w:lineRule="auto"/>
+              <w:jc w:val="center"/>
+            </w:pPr>
+            <w:r>
+              <w:rPr>
+                <w:rFonts w:ascii="Calibri" w:hAnsi="Calibri" w:eastAsia="Microsoft YaHei"/>
+                <w:b w:val="0"/>
+                <w:i w:val="0"/>
+                <w:color w:val="1F1F1F"/>
+                <w:sz w:val="18"/>
+              </w:rPr>
+              <w:t>14.29</w:t>
+            </w:r>
+          </w:p>
+        </w:tc>
+        <w:tc>
+          <w:tcPr>
+            <w:tcW w:type="dxa" w:w="1200"/>
+            <w:tcMar>
+              <w:top w:w="80" w:type="dxa"/>
+              <w:start w:w="120" w:type="dxa"/>
+              <w:bottom w:w="80" w:type="dxa"/>
+              <w:end w:w="120" w:type="dxa"/>
+            </w:tcMar>
+            <w:vAlign w:val="center"/>
+          </w:tcPr>
+          <w:p>
+            <w:pPr>
+              <w:spacing w:before="0" w:after="40" w:line="252" w:lineRule="auto"/>
+              <w:jc w:val="center"/>
+            </w:pPr>
+            <w:r>
+              <w:rPr>
+                <w:rFonts w:ascii="Calibri" w:hAnsi="Calibri" w:eastAsia="Microsoft YaHei"/>
+                <w:b w:val="0"/>
+                <w:i w:val="0"/>
+                <w:color w:val="1F1F1F"/>
+                <w:sz w:val="18"/>
+              </w:rPr>
+              <w:t>29.94</w:t>
+            </w:r>
+          </w:p>
+        </w:tc>
+        <w:tc>
+          <w:tcPr>
+            <w:tcW w:type="dxa" w:w="1410"/>
+            <w:tcMar>
+              <w:top w:w="80" w:type="dxa"/>
+              <w:start w:w="120" w:type="dxa"/>
+              <w:bottom w:w="80" w:type="dxa"/>
+              <w:end w:w="120" w:type="dxa"/>
+            </w:tcMar>
+            <w:vAlign w:val="center"/>
+          </w:tcPr>
+          <w:p>
+            <w:pPr>
+              <w:spacing w:before="0" w:after="40" w:line="252" w:lineRule="auto"/>
+              <w:jc w:val="left"/>
+            </w:pPr>
+            <w:r>
+              <w:rPr>
+                <w:rFonts w:ascii="Calibri" w:hAnsi="Calibri" w:eastAsia="Microsoft YaHei"/>
+                <w:b w:val="0"/>
+                <w:i w:val="0"/>
+                <w:color w:val="1F1F1F"/>
+                <w:sz w:val="18"/>
+              </w:rPr>
+              <w:t>KNO 参数更少但约 2.10x 慢；CFD-2D 中计算瓶颈来自 2D FFT、复数矩阵乘和 11-step rollout。</w:t>
+            </w:r>
+          </w:p>
+        </w:tc>
+      </w:tr>
+    </w:tbl>
+    <w:p/>
+    <w:p>
+      <w:pPr>
+        <w:spacing w:before="0" w:after="120" w:line="264" w:lineRule="auto"/>
+      </w:pPr>
+      <w:r>
+        <w:rPr>
+          <w:rFonts w:ascii="Calibri" w:hAnsi="Calibri" w:eastAsia="Microsoft YaHei"/>
+          <w:b w:val="0"/>
+          <w:i w:val="0"/>
+          <w:color w:val="1F1F1F"/>
+          <w:sz w:val="22"/>
+        </w:rPr>
+        <w:t>这组对比说明，CFD-2D 差距不是简单的“参数越多越好”。AM-FNO 的参数更多，但这些参数主要服务于多层频域 kernel 生成和局部 pointwise mixing，直接增强空间频率响应；KNO 的参数较少，集中在观测空间 encoder/decoder 与 Koopman matrix，适合学习可复合的时间推进，但对 CFD-2D 的多变量局部结构表达不足。</w:t>
+      </w:r>
+    </w:p>
+    <w:p>
+      <w:pPr>
+        <w:spacing w:before="0" w:after="120" w:line="264" w:lineRule="auto"/>
+      </w:pPr>
+      <w:r>
+        <w:rPr>
+          <w:rFonts w:ascii="Calibri" w:hAnsi="Calibri" w:eastAsia="Microsoft YaHei"/>
+          <w:b w:val="0"/>
+          <w:i w:val="0"/>
+          <w:color w:val="1F1F1F"/>
+          <w:sz w:val="22"/>
+        </w:rPr>
+        <w:t>从模型设计看，本次 CFD 差距主要来自四点：</w:t>
+      </w:r>
+    </w:p>
+    <w:p>
+      <w:pPr>
+        <w:pStyle w:val="ListNumber"/>
+      </w:pPr>
+      <w:r>
+        <w:rPr>
+          <w:rFonts w:ascii="Calibri" w:hAnsi="Calibri" w:eastAsia="Microsoft YaHei"/>
+          <w:b/>
+          <w:i w:val="0"/>
+          <w:color w:val="1F1F1F"/>
+          <w:sz w:val="22"/>
+        </w:rPr>
+        <w:t>变量耦合不足。</w:t>
+      </w:r>
+      <w:r>
+        <w:rPr>
+          <w:rFonts w:ascii="Calibri" w:hAnsi="Calibri" w:eastAsia="Microsoft YaHei"/>
+          <w:b w:val="0"/>
+          <w:i w:val="0"/>
+          <w:color w:val="1F1F1F"/>
+          <w:sz w:val="22"/>
+        </w:rPr>
+        <w:t xml:space="preserve"> CFD-2D 的 density、pressure、Vx、Vy 之间存在强耦合；当前 KNO 只是把 10 帧历史和 4 个变量压平到 40 个通道，再用一个线性 encoder 混合，缺少 AM-FNO 那种多层 spectral block 的反复交互。</w:t>
+      </w:r>
+    </w:p>
+    <w:p>
+      <w:pPr>
+        <w:pStyle w:val="ListNumber"/>
+      </w:pPr>
+      <w:r>
+        <w:rPr>
+          <w:rFonts w:ascii="Calibri" w:hAnsi="Calibri" w:eastAsia="Microsoft YaHei"/>
+          <w:b/>
+          <w:i w:val="0"/>
+          <w:color w:val="1F1F1F"/>
+          <w:sz w:val="22"/>
+        </w:rPr>
+        <w:t>空间条件不足。</w:t>
+      </w:r>
+      <w:r>
+        <w:rPr>
+          <w:rFonts w:ascii="Calibri" w:hAnsi="Calibri" w:eastAsia="Microsoft YaHei"/>
+          <w:b w:val="0"/>
+          <w:i w:val="0"/>
+          <w:color w:val="1F1F1F"/>
+          <w:sz w:val="22"/>
+        </w:rPr>
+        <w:t xml:space="preserve"> AM-FNO 显式拼接 grid 坐标；当前 KNO 没有把 grid 输入模型。对周期 CFD 数据这不是致命问题，但会削弱模型对空间结构和局部变化的条件化能力。</w:t>
+      </w:r>
+    </w:p>
+    <w:p>
+      <w:pPr>
+        <w:pStyle w:val="ListNumber"/>
+      </w:pPr>
+      <w:r>
+        <w:rPr>
+          <w:rFonts w:ascii="Calibri" w:hAnsi="Calibri" w:eastAsia="Microsoft YaHei"/>
+          <w:b/>
+          <w:i w:val="0"/>
+          <w:color w:val="1F1F1F"/>
+          <w:sz w:val="22"/>
+        </w:rPr>
+        <w:t>低频 Koopman 偏置。</w:t>
+      </w:r>
+      <w:r>
+        <w:rPr>
+          <w:rFonts w:ascii="Calibri" w:hAnsi="Calibri" w:eastAsia="Microsoft YaHei"/>
+          <w:b w:val="0"/>
+          <w:i w:val="0"/>
+          <w:color w:val="1F1F1F"/>
+          <w:sz w:val="22"/>
+        </w:rPr>
+        <w:t xml:space="preserve"> KNO 的 Koopman matrix 只作用在低频 modes 上，高频部分主要靠 1x1 conv 补偿；CFD-2D 的小尺度涡旋/激波样变化更依赖局部与高频表达。</w:t>
+      </w:r>
+    </w:p>
+    <w:p>
+      <w:pPr>
+        <w:pStyle w:val="ListNumber"/>
+      </w:pPr>
+      <w:r>
+        <w:rPr>
+          <w:rFonts w:ascii="Calibri" w:hAnsi="Calibri" w:eastAsia="Microsoft YaHei"/>
+          <w:b/>
+          <w:i w:val="0"/>
+          <w:color w:val="1F1F1F"/>
+          <w:sz w:val="22"/>
+        </w:rPr>
+        <w:t>容量分配不同。</w:t>
+      </w:r>
+      <w:r>
+        <w:rPr>
+          <w:rFonts w:ascii="Calibri" w:hAnsi="Calibri" w:eastAsia="Microsoft YaHei"/>
+          <w:b w:val="0"/>
+          <w:i w:val="0"/>
+          <w:color w:val="1F1F1F"/>
+          <w:sz w:val="22"/>
+        </w:rPr>
+        <w:t xml:space="preserve"> CFD-2D 主 KNO 只有约 52.8 万参数，而 AM-FNO 约 228.6 万参数。扩大 KNO 到 </w:t>
+      </w:r>
+      <w:r>
+        <w:rPr>
+          <w:rFonts w:ascii="Consolas" w:hAnsi="Consolas" w:eastAsia="Microsoft YaHei"/>
+          <w:b w:val="0"/>
+          <w:i w:val="0"/>
+          <w:color w:val="333333"/>
+          <w:sz w:val="19"/>
+        </w:rPr>
+        <w:t>o=64</w:t>
+      </w:r>
+      <w:r>
+        <w:rPr>
+          <w:rFonts w:ascii="Calibri" w:hAnsi="Calibri" w:eastAsia="Microsoft YaHei"/>
+          <w:b w:val="0"/>
+          <w:i w:val="0"/>
+          <w:color w:val="1F1F1F"/>
+          <w:sz w:val="22"/>
+        </w:rPr>
+        <w:t xml:space="preserve"> 后参数量接近 AM-FNO（约 210.7 万），但早期误差只小幅改善且震荡更强，说明问题不只是容量，而是容量放在了不够适合 CFD-2D 的 Koopman latent matrix 上。</w:t>
+      </w:r>
+    </w:p>
+    <w:p>
+      <w:pPr>
+        <w:spacing w:before="0" w:after="120" w:line="264" w:lineRule="auto"/>
+      </w:pPr>
+      <w:r>
+        <w:rPr>
+          <w:rFonts w:ascii="Calibri" w:hAnsi="Calibri" w:eastAsia="Microsoft YaHei"/>
+          <w:b w:val="0"/>
+          <w:i w:val="0"/>
+          <w:color w:val="1F1F1F"/>
+          <w:sz w:val="22"/>
+        </w:rPr>
+        <w:t xml:space="preserve">因此，若后续希望缩小 CFD-2D 差距，优先方向不是继续盲目增大 </w:t>
+      </w:r>
+      <w:r>
+        <w:rPr>
+          <w:rFonts w:ascii="Consolas" w:hAnsi="Consolas" w:eastAsia="Microsoft YaHei"/>
+          <w:b w:val="0"/>
+          <w:i w:val="0"/>
+          <w:color w:val="333333"/>
+          <w:sz w:val="19"/>
+        </w:rPr>
+        <w:t>o</w:t>
+      </w:r>
+      <w:r>
+        <w:rPr>
+          <w:rFonts w:ascii="Calibri" w:hAnsi="Calibri" w:eastAsia="Microsoft YaHei"/>
+          <w:b w:val="0"/>
+          <w:i w:val="0"/>
+          <w:color w:val="1F1F1F"/>
+          <w:sz w:val="22"/>
+        </w:rPr>
+        <w:t>，而是改模型结构：加入 grid conditioning、变量专用 encoder、跨变量 mixing、强局部卷积分支，或设计 rollout-aware loss。当前结果更适合解释为：KNO 的时间复合优势在 NS-2D 上比较自然，但原始 compact KNO 迁移到 AM-FNO 的多变量 CFD 任务时，需要额外结构改造。</w:t>
+      </w:r>
+    </w:p>
+    <w:p>
+      <w:pPr>
         <w:pStyle w:val="Heading1"/>
       </w:pPr>
       <w:r>

</xml_diff>